<commit_message>
Adding sql result with question
</commit_message>
<xml_diff>
--- a/assignment-sql.docx
+++ b/assignment-sql.docx
@@ -17,16 +17,34 @@
     </w:p>
     <w:p>
       <w:pPr>
-        <w:rPr>
-          <w:noProof/>
-        </w:rPr>
-      </w:pPr>
-      <w:r>
-        <w:rPr>
-          <w:noProof/>
-        </w:rPr>
-        <w:t>Question 1</w:t>
-      </w:r>
+        <w:pStyle w:val="query-text-line"/>
+        <w:shd w:val="clear" w:color="auto" w:fill="E9EEF6"/>
+        <w:spacing w:before="0" w:beforeAutospacing="0" w:after="0" w:afterAutospacing="0"/>
+        <w:rPr>
+          <w:rFonts w:ascii="Arial" w:hAnsi="Arial" w:cs="Arial"/>
+          <w:color w:val="1F1F1F"/>
+        </w:rPr>
+      </w:pPr>
+      <w:r>
+        <w:rPr>
+          <w:noProof/>
+        </w:rPr>
+        <w:t xml:space="preserve">Question 1: </w:t>
+      </w:r>
+      <w:r>
+        <w:rPr>
+          <w:rFonts w:ascii="Arial" w:hAnsi="Arial" w:cs="Arial"/>
+          <w:color w:val="1F1F1F"/>
+        </w:rPr>
+        <w:t>Write a query to display each employee's full name, occupation and department name. Only include employees who have a valid department assigned.</w:t>
+      </w:r>
+    </w:p>
+    <w:p>
+      <w:pPr>
+        <w:rPr>
+          <w:noProof/>
+        </w:rPr>
+      </w:pPr>
     </w:p>
     <w:p>
       <w:pPr>
@@ -96,6 +114,20 @@
         </w:rPr>
         <w:t>Question 2</w:t>
       </w:r>
+      <w:r>
+        <w:rPr>
+          <w:noProof/>
+        </w:rPr>
+        <w:t xml:space="preserve">: </w:t>
+      </w:r>
+      <w:r>
+        <w:rPr>
+          <w:rFonts w:ascii="Arial" w:hAnsi="Arial" w:cs="Arial"/>
+          <w:color w:val="1F1F1F"/>
+          <w:shd w:val="clear" w:color="auto" w:fill="E9EEF6"/>
+        </w:rPr>
+        <w:t>2. Write a query to show the average salary, minimum salary, and maximum salary in each department.</w:t>
+      </w:r>
     </w:p>
     <w:p>
       <w:r>
@@ -124,6 +156,17 @@
       <w:r>
         <w:t>Question 3</w:t>
       </w:r>
+      <w:r>
+        <w:t xml:space="preserve">: </w:t>
+      </w:r>
+      <w:r>
+        <w:rPr>
+          <w:rFonts w:ascii="Arial" w:hAnsi="Arial" w:cs="Arial"/>
+          <w:color w:val="1F1F1F"/>
+          <w:shd w:val="clear" w:color="auto" w:fill="E9EEF6"/>
+        </w:rPr>
+        <w:t xml:space="preserve"> Write a query to display the names of employees whose salary is above the average salary of all employees. Include their first name, last name, and salary.</w:t>
+      </w:r>
     </w:p>
     <w:p>
       <w:r>
@@ -165,8 +208,12 @@
     </w:p>
     <w:p>
       <w:pPr>
-        <w:rPr>
-          <w:noProof/>
+        <w:pStyle w:val="query-text-line"/>
+        <w:shd w:val="clear" w:color="auto" w:fill="E9EEF6"/>
+        <w:spacing w:before="0" w:beforeAutospacing="0" w:after="0" w:afterAutospacing="0"/>
+        <w:rPr>
+          <w:rFonts w:ascii="Arial" w:hAnsi="Arial" w:cs="Arial"/>
+          <w:color w:val="1F1F1F"/>
         </w:rPr>
       </w:pPr>
       <w:r>
@@ -175,6 +222,62 @@
         </w:rPr>
         <w:t>Question 4</w:t>
       </w:r>
+      <w:r>
+        <w:rPr>
+          <w:noProof/>
+        </w:rPr>
+        <w:t xml:space="preserve">: </w:t>
+      </w:r>
+      <w:r>
+        <w:rPr>
+          <w:rFonts w:ascii="Arial" w:hAnsi="Arial" w:cs="Arial"/>
+          <w:color w:val="1F1F1F"/>
+        </w:rPr>
+        <w:t>Write a query to list all employees (from</w:t>
+      </w:r>
+    </w:p>
+    <w:p>
+      <w:pPr>
+        <w:pStyle w:val="query-text-line"/>
+        <w:shd w:val="clear" w:color="auto" w:fill="E9EEF6"/>
+        <w:spacing w:before="0" w:beforeAutospacing="0" w:after="0" w:afterAutospacing="0"/>
+        <w:rPr>
+          <w:rFonts w:ascii="Arial" w:hAnsi="Arial" w:cs="Arial"/>
+          <w:color w:val="1F1F1F"/>
+        </w:rPr>
+      </w:pPr>
+      <w:r>
+        <w:rPr>
+          <w:rFonts w:ascii="Arial" w:hAnsi="Arial" w:cs="Arial"/>
+          <w:color w:val="1F1F1F"/>
+        </w:rPr>
+        <w:t>employee_demographics)  and their corresponding occupation.</w:t>
+      </w:r>
+    </w:p>
+    <w:p>
+      <w:pPr>
+        <w:pStyle w:val="query-text-line"/>
+        <w:shd w:val="clear" w:color="auto" w:fill="E9EEF6"/>
+        <w:spacing w:before="0" w:beforeAutospacing="0" w:after="0" w:afterAutospacing="0"/>
+        <w:rPr>
+          <w:rFonts w:ascii="Arial" w:hAnsi="Arial" w:cs="Arial"/>
+          <w:color w:val="1F1F1F"/>
+        </w:rPr>
+      </w:pPr>
+      <w:r>
+        <w:rPr>
+          <w:rFonts w:ascii="Arial" w:hAnsi="Arial" w:cs="Arial"/>
+          <w:color w:val="1F1F1F"/>
+        </w:rPr>
+        <w:t>If an employee doesn't have a salary record, display 'Not Assigned' under the occupation column.</w:t>
+      </w:r>
+    </w:p>
+    <w:p>
+      <w:pPr>
+        <w:rPr>
+          <w:noProof/>
+        </w:rPr>
+      </w:pPr>
     </w:p>
     <w:p>
       <w:r>
@@ -515,6 +618,19 @@
     <w:semiHidden/>
     <w:rsid w:val="001E1CC9"/>
   </w:style>
+  <w:style w:type="paragraph" w:customStyle="1" w:styleId="query-text-line">
+    <w:name w:val="query-text-line"/>
+    <w:basedOn w:val="Normal"/>
+    <w:rsid w:val="003144C9"/>
+    <w:pPr>
+      <w:spacing w:before="100" w:beforeAutospacing="1" w:after="100" w:afterAutospacing="1" w:line="240" w:lineRule="auto"/>
+    </w:pPr>
+    <w:rPr>
+      <w:rFonts w:ascii="Times New Roman" w:eastAsia="Times New Roman" w:hAnsi="Times New Roman" w:cs="Times New Roman"/>
+      <w:sz w:val="24"/>
+      <w:szCs w:val="24"/>
+    </w:rPr>
+  </w:style>
 </w:styles>
 </file>
 

</xml_diff>